<commit_message>
Sync docs with final BC balance and ILE analysis report.
Update README, PREMISAS, and the functional Word doc to match April 2026 totals, box Type 3 formula, and the analysis tab.
</commit_message>
<xml_diff>
--- a/DOCUMENTO_FUNCIONAL_BIOMASA.docx
+++ b/DOCUMENTO_FUNCIONAL_BIOMASA.docx
@@ -19,7 +19,7 @@
         <w:rPr>
           <w:i/>
         </w:rPr>
-        <w:t>Fecha: 15/06/2026</w:t>
+        <w:t>Fecha: 22/07/2026</w:t>
         <w:br/>
       </w:r>
       <w:r>
@@ -33,7 +33,7 @@
         <w:rPr>
           <w:i/>
         </w:rPr>
-        <w:t>Estado premisas de negocio: Validadas (referencia marzo 2026)</w:t>
+        <w:t>Estado premisas de negocio: Validadas (referencia abril 2026)</w:t>
       </w:r>
     </w:p>
     <w:p>
@@ -81,7 +81,7 @@
         <w:pStyle w:val="ListBullet"/>
       </w:pPr>
       <w:r>
-        <w:t>Aplica reglas de negocio acordadas (pkpackaging, rtype, cajas TINA) de forma consistente.</w:t>
+        <w:t>Aplica reglas de negocio acordadas (pkpackaging, balance de masa) de forma consistente.</w:t>
       </w:r>
     </w:p>
     <w:p>
@@ -97,7 +97,7 @@
         <w:pStyle w:val="ListBullet"/>
       </w:pPr>
       <w:r>
-        <w:t>Desglosa las entradas en stock y merma segun proc_packs.rtype.</w:t>
+        <w:t>Calcula stock y merma: Entrada TINA = Salidas CAJA + Stock + Merma.</w:t>
       </w:r>
     </w:p>
     <w:p>
@@ -224,7 +224,7 @@
           </w:tcPr>
           <w:p>
             <w:r>
-              <w:t>dbo.proc_matxacts</w:t>
+              <w:t>dbo.proc_matxacts + dbo.proc_packs</w:t>
             </w:r>
           </w:p>
         </w:tc>
@@ -234,7 +234,7 @@
           </w:tcPr>
           <w:p>
             <w:r>
-              <w:t>Consumo de cajas TINA (xactpath = 1)</w:t>
+              <w:t>Kg cajas = consumo TINA; fecha diaria = regtime de la tina (pack = proc_packs.id)</w:t>
             </w:r>
           </w:p>
         </w:tc>
@@ -298,7 +298,7 @@
           </w:tcPr>
           <w:p>
             <w:r>
-              <w:t>Ventas por lote; campo [Kilos]</w:t>
+              <w:t>Ventas, ajustes +/−, stock E/G; campo [Kilos] / Quantity</w:t>
             </w:r>
           </w:p>
         </w:tc>
@@ -331,6 +331,38 @@
           <w:p>
             <w:r>
               <w:t>Pedido ([Order No.]) del albaran</w:t>
+            </w:r>
+          </w:p>
+        </w:tc>
+      </w:tr>
+      <w:tr>
+        <w:tc>
+          <w:tcPr>
+            <w:tcW w:type="dxa" w:w="2880"/>
+          </w:tcPr>
+          <w:p>
+            <w:r>
+              <w:t>Business Central</w:t>
+            </w:r>
+          </w:p>
+        </w:tc>
+        <w:tc>
+          <w:tcPr>
+            <w:tcW w:type="dxa" w:w="2880"/>
+          </w:tcPr>
+          <w:p>
+            <w:r>
+              <w:t>bc.[Conversion productos]</w:t>
+            </w:r>
+          </w:p>
+        </w:tc>
+        <w:tc>
+          <w:tcPr>
+            <w:tcW w:type="dxa" w:w="2880"/>
+          </w:tcPr>
+          <w:p>
+            <w:r>
+              <w:t>Cod. bascula Innova → Cod. producto BC</w:t>
             </w:r>
           </w:p>
         </w:tc>
@@ -428,7 +460,7 @@
           </w:tcPr>
           <w:p>
             <w:r>
-              <w:t>Stock (en entradas)</w:t>
+              <w:t>Stock</w:t>
             </w:r>
           </w:p>
         </w:tc>
@@ -438,7 +470,7 @@
           </w:tcPr>
           <w:p>
             <w:r>
-              <w:t>pkpackaging = 3 y proc_packs.rtype &lt;&gt; 12 (o NULL)</w:t>
+              <w:t>Inventario TINA al cierre: stock inicial + Entradas − TINA procesada</w:t>
             </w:r>
           </w:p>
         </w:tc>
@@ -450,7 +482,7 @@
           </w:tcPr>
           <w:p>
             <w:r>
-              <w:t>Merma (en entradas)</w:t>
+              <w:t>Merma</w:t>
             </w:r>
           </w:p>
         </w:tc>
@@ -460,7 +492,7 @@
           </w:tcPr>
           <w:p>
             <w:r>
-              <w:t>pkpackaging = 3 y proc_packs.rtype = 12</w:t>
+              <w:t>Entrada TINA − Salidas CAJA − Stock (no es proc_packs.rtype)</w:t>
             </w:r>
           </w:p>
         </w:tc>
@@ -472,7 +504,7 @@
           </w:tcPr>
           <w:p>
             <w:r>
-              <w:t>Cajas (kg)</w:t>
+              <w:t>TINA procesada (kg)</w:t>
             </w:r>
           </w:p>
         </w:tc>
@@ -482,7 +514,7 @@
           </w:tcPr>
           <w:p>
             <w:r>
-              <w:t>Consumo TINA en proc_matxacts, xactpath = 1, nombre con 'tina'</w:t>
+              <w:t>proc_matxacts (xactpath=1, nombre con 'tina'); fecha = proc_packs.regtime de la TINA</w:t>
             </w:r>
           </w:p>
         </w:tc>
@@ -494,7 +526,7 @@
           </w:tcPr>
           <w:p>
             <w:r>
-              <w:t>Identidad</w:t>
+              <w:t>Balance masa</w:t>
             </w:r>
           </w:p>
         </w:tc>
@@ -504,7 +536,7 @@
           </w:tcPr>
           <w:p>
             <w:r>
-              <w:t>Entradas = Stock + Merma</w:t>
+              <w:t>Entrada TINA = Salidas CAJA + Stock + Merma</w:t>
             </w:r>
           </w:p>
         </w:tc>
@@ -566,6 +598,28 @@
           </w:tcPr>
           <w:p>
             <w:r>
+              <w:t>Merma (kg)</w:t>
+            </w:r>
+          </w:p>
+        </w:tc>
+        <w:tc>
+          <w:tcPr>
+            <w:tcW w:type="dxa" w:w="4320"/>
+          </w:tcPr>
+          <w:p>
+            <w:r>
+              <w:t>Entradas TINA − Salidas CAJA − Stock</w:t>
+            </w:r>
+          </w:p>
+        </w:tc>
+      </w:tr>
+      <w:tr>
+        <w:tc>
+          <w:tcPr>
+            <w:tcW w:type="dxa" w:w="4320"/>
+          </w:tcPr>
+          <w:p>
+            <w:r>
               <w:t>Diferencia (kg)</w:t>
             </w:r>
           </w:p>
@@ -576,7 +630,7 @@
           </w:tcPr>
           <w:p>
             <w:r>
-              <w:t>Entradas − Cajas (consumo TINA)</w:t>
+              <w:t>Entradas TINA − TINA procesada</w:t>
             </w:r>
           </w:p>
         </w:tc>
@@ -714,7 +768,7 @@
         <w:pStyle w:val="ListBullet"/>
       </w:pPr>
       <w:r>
-        <w:t>Entradas de biomasa (kg y packs)</w:t>
+        <w:t>Entradas TINA, salidas CAJA, stock inventario y merma (balance de masa)</w:t>
       </w:r>
     </w:p>
     <w:p>
@@ -722,15 +776,7 @@
         <w:pStyle w:val="ListBullet"/>
       </w:pPr>
       <w:r>
-        <w:t>Stock en entradas y merma en entradas (kg)</w:t>
-      </w:r>
-    </w:p>
-    <w:p>
-      <w:pPr>
-        <w:pStyle w:val="ListBullet"/>
-      </w:pPr>
-      <w:r>
-        <w:t>Cajas consumidas (kg y movimientos)</w:t>
+        <w:t>TINA procesada (kg y movimientos)</w:t>
       </w:r>
     </w:p>
     <w:p>
@@ -826,7 +872,79 @@
         <w:pStyle w:val="Heading2"/>
       </w:pPr>
       <w:r>
-        <w:t>6.3 Tablas exportables a Excel</w:t>
+        <w:t>6.3 Pestanas del informe HTML</w:t>
+      </w:r>
+    </w:p>
+    <w:p>
+      <w:pPr>
+        <w:pStyle w:val="ListBullet"/>
+      </w:pPr>
+      <w:r>
+        <w:t>Introduccion, Resumen, Graficas, Detalle diario, Balance (stock/merma)</w:t>
+      </w:r>
+    </w:p>
+    <w:p>
+      <w:pPr>
+        <w:pStyle w:val="ListBullet"/>
+      </w:pPr>
+      <w:r>
+        <w:t>Cruce BC por lote (number = Lot No.)</w:t>
+      </w:r>
+    </w:p>
+    <w:p>
+      <w:pPr>
+        <w:pStyle w:val="ListBullet"/>
+      </w:pPr>
+      <w:r>
+        <w:t>Balance BC E/G en kg (sin detalle por lote en HTML)</w:t>
+      </w:r>
+    </w:p>
+    <w:p>
+      <w:pPr>
+        <w:pStyle w:val="ListBullet"/>
+      </w:pPr>
+      <w:r>
+        <w:t>Balance por tipo en cajas: Inicial + Type 2 − Type 1 − Type 3</w:t>
+      </w:r>
+    </w:p>
+    <w:p>
+      <w:pPr>
+        <w:pStyle w:val="ListBullet"/>
+      </w:pPr>
+      <w:r>
+        <w:t>Stock inicial / Stock final BC E/G por producto</w:t>
+      </w:r>
+    </w:p>
+    <w:p>
+      <w:pPr>
+        <w:pStyle w:val="ListBullet"/>
+      </w:pPr>
+      <w:r>
+        <w:t>Analisis ILE (1/2/3): validacion de ecuacion y Type 3 por usuario/dia/producto</w:t>
+      </w:r>
+    </w:p>
+    <w:p>
+      <w:pPr>
+        <w:pStyle w:val="ListBullet"/>
+      </w:pPr>
+      <w:r>
+        <w:t>Materiales y Debug (SQL)</w:t>
+      </w:r>
+    </w:p>
+    <w:p>
+      <w:pPr>
+        <w:pStyle w:val="ListBullet"/>
+      </w:pPr>
+      <w:r>
+        <w:t>Pie unico: nota VAP + nota ajustes negativos Type 3</w:t>
+      </w:r>
+    </w:p>
+    <w:p>
+      <w:pPr>
+        <w:pStyle w:val="Heading2"/>
+      </w:pPr>
+      <w:r>
+        <w:t>6.4 Tablas exportables a Excel</w:t>
       </w:r>
     </w:p>
     <w:p>
@@ -858,6 +976,14 @@
         <w:pStyle w:val="ListBullet"/>
       </w:pPr>
       <w:r>
+        <w:t>Balances BC E/G (kg y cajas) y analisis ILE</w:t>
+      </w:r>
+    </w:p>
+    <w:p>
+      <w:pPr>
+        <w:pStyle w:val="ListBullet"/>
+      </w:pPr>
+      <w:r>
         <w:t>Top 15 materiales de entrada y de salida</w:t>
       </w:r>
     </w:p>
@@ -866,7 +992,7 @@
         <w:pStyle w:val="ListBullet"/>
       </w:pPr>
       <w:r>
-        <w:t>Exportacion global en un unico .xlsx (5 hojas)</w:t>
+        <w:t>Exportacion global en un unico libro Excel</w:t>
       </w:r>
     </w:p>
     <w:p>
@@ -946,7 +1072,7 @@
         <w:pStyle w:val="Heading1"/>
       </w:pPr>
       <w:r>
-        <w:t>8. Valores de referencia — marzo 2026</w:t>
+        <w:t>8. Valores de referencia — abril 2026</w:t>
       </w:r>
     </w:p>
     <w:p>
@@ -954,7 +1080,7 @@
         <w:rPr>
           <w:b w:val="0"/>
         </w:rPr>
-        <w:t>Totales obtenidos con las premisas validadas. Sirven como control al regenerar informes.</w:t>
+        <w:t>Totales obtenidos con las premisas validadas (ultima referencia operativa). Sirven como control al regenerar informes.</w:t>
       </w:r>
     </w:p>
     <w:tbl>
@@ -996,7 +1122,7 @@
           </w:tcPr>
           <w:p>
             <w:r>
-              <w:t>Entradas</w:t>
+              <w:t>Entradas TINA</w:t>
             </w:r>
           </w:p>
         </w:tc>
@@ -1006,7 +1132,7 @@
           </w:tcPr>
           <w:p>
             <w:r>
-              <w:t>665.081,58 kg</w:t>
+              <w:t>518.532,75 kg</w:t>
             </w:r>
           </w:p>
         </w:tc>
@@ -1018,7 +1144,7 @@
           </w:tcPr>
           <w:p>
             <w:r>
-              <w:t>Salidas</w:t>
+              <w:t>TINA procesada</w:t>
             </w:r>
           </w:p>
         </w:tc>
@@ -1028,7 +1154,7 @@
           </w:tcPr>
           <w:p>
             <w:r>
-              <w:t>492.968,78 kg</w:t>
+              <w:t>353.246,00 kg</w:t>
             </w:r>
           </w:p>
         </w:tc>
@@ -1040,7 +1166,7 @@
           </w:tcPr>
           <w:p>
             <w:r>
-              <w:t>Stock (entrada)</w:t>
+              <w:t>Salidas CAJA</w:t>
             </w:r>
           </w:p>
         </w:tc>
@@ -1050,7 +1176,7 @@
           </w:tcPr>
           <w:p>
             <w:r>
-              <w:t>235.462,58 kg</w:t>
+              <w:t>410.802,15 kg · 71.174 cajas</w:t>
             </w:r>
           </w:p>
         </w:tc>
@@ -1062,7 +1188,7 @@
           </w:tcPr>
           <w:p>
             <w:r>
-              <w:t>Merma (entrada)</w:t>
+              <w:t>Stock de tinas</w:t>
             </w:r>
           </w:p>
         </w:tc>
@@ -1072,7 +1198,7 @@
           </w:tcPr>
           <w:p>
             <w:r>
-              <w:t>429.619,00 kg</w:t>
+              <w:t>169.158,75 kg</w:t>
             </w:r>
           </w:p>
         </w:tc>
@@ -1084,7 +1210,7 @@
           </w:tcPr>
           <w:p>
             <w:r>
-              <w:t>Cajas</w:t>
+              <w:t>Merma</w:t>
             </w:r>
           </w:p>
         </w:tc>
@@ -1094,7 +1220,7 @@
           </w:tcPr>
           <w:p>
             <w:r>
-              <w:t>424.729,00 kg</w:t>
+              <w:t>−61.428,15 kg (−11,85 %)</w:t>
             </w:r>
           </w:p>
         </w:tc>
@@ -1106,7 +1232,7 @@
           </w:tcPr>
           <w:p>
             <w:r>
-              <w:t>Balance E-S</w:t>
+              <w:t>Cruce BC lotes</w:t>
             </w:r>
           </w:p>
         </w:tc>
@@ -1116,7 +1242,7 @@
           </w:tcPr>
           <w:p>
             <w:r>
-              <w:t>172.112,80 kg</w:t>
+              <w:t>66.384 / 71.174 (93,27 %)</w:t>
             </w:r>
           </w:p>
         </w:tc>
@@ -1128,7 +1254,7 @@
           </w:tcPr>
           <w:p>
             <w:r>
-              <w:t>Lotes salida Innova / enlazados BC</w:t>
+              <w:t>Balance BC E/G (check kg)</w:t>
             </w:r>
           </w:p>
         </w:tc>
@@ -1138,7 +1264,7 @@
           </w:tcPr>
           <w:p>
             <w:r>
-              <w:t>80.737 / 69.775 (86,42 %)</w:t>
+              <w:t>−70,56 kg</w:t>
             </w:r>
           </w:p>
         </w:tc>
@@ -1150,7 +1276,7 @@
           </w:tcPr>
           <w:p>
             <w:r>
-              <w:t>Kg Innova enlazado / Kg BC (ILE)</w:t>
+              <w:t>Balance cajas</w:t>
             </w:r>
           </w:p>
         </w:tc>
@@ -1160,7 +1286,7 @@
           </w:tcPr>
           <w:p>
             <w:r>
-              <w:t>422.510,84 / 423.208,70 kg</w:t>
+              <w:t>Ini 6.829 · Ent 74.352 · Ven 73.320 · Adj− 3.884 · Check −228</w:t>
             </w:r>
           </w:p>
         </w:tc>
@@ -1172,7 +1298,7 @@
           </w:tcPr>
           <w:p>
             <w:r>
-              <w:t>Diferencia kg enlazados (I−BC)</w:t>
+              <w:t>Analisis Type 3</w:t>
             </w:r>
           </w:p>
         </w:tc>
@@ -1182,7 +1308,7 @@
           </w:tcPr>
           <w:p>
             <w:r>
-              <w:t>−697,86 kg</w:t>
+              <w:t>3 usuarios · top ACZ · muchos Type 3 con Kilos=0</w:t>
             </w:r>
           </w:p>
         </w:tc>
@@ -1210,7 +1336,7 @@
         <w:pStyle w:val="IntenseQuote"/>
       </w:pPr>
       <w:r>
-        <w:t>python generar_reporte_biomasa.py --start 01/03/2026 --end 31/03/2026</w:t>
+        <w:t>python generar_reporte_biomasa.py --start 01/04/2026 --end 30/04/2026</w:t>
       </w:r>
     </w:p>
     <w:p>
@@ -1330,7 +1456,7 @@
         <w:pStyle w:val="ListBullet"/>
       </w:pPr>
       <w:r>
-        <w:t>Cambios en maestros (pkpackaging, rtype) requieren actualizar PREMISAS.md y regenerar mes de control.</w:t>
+        <w:t>Cambios en maestros (pkpackaging) requieren actualizar PREMISAS.md y regenerar mes de control.</w:t>
       </w:r>
     </w:p>
     <w:p>

</xml_diff>